<commit_message>
Update HIDRO site content
Co-authored-by: Copilot App <223556219+Copilot@users.noreply.github.com>
</commit_message>
<xml_diff>
--- a/materiais/HIDRO_Instrumentos_de_avaliacao.docx
+++ b/materiais/HIDRO_Instrumentos_de_avaliacao.docx
@@ -1796,7 +1796,7 @@
           <w:sz w:val="21"/>
           <w:szCs w:val="21"/>
         </w:rPr>
-        <w:t xml:space="preserve"> O que acontece em uma enchente (inundação)?</w:t>
+        <w:t xml:space="preserve"> O que é uma enchente?</w:t>
       </w:r>
     </w:p>
     <w:p>
@@ -1812,7 +1812,7 @@
           <w:sz w:val="20"/>
           <w:szCs w:val="20"/>
         </w:rPr>
-        <w:t xml:space="preserve">(   )  A)  O rio sobe e transborda para as áreas próximas</w:t>
+        <w:t xml:space="preserve">(   )  A)  Aumento do nível da água dentro do rio, sem transbordar</w:t>
       </w:r>
     </w:p>
     <w:p>
@@ -1828,7 +1828,7 @@
           <w:sz w:val="20"/>
           <w:szCs w:val="20"/>
         </w:rPr>
-        <w:t xml:space="preserve">(   )  B)  A chuva forma poças pequenas</w:t>
+        <w:t xml:space="preserve">(   )  B)  Acúmulo de água de chuva na rua por falta de escoamento</w:t>
       </w:r>
     </w:p>
     <w:p>
@@ -1844,7 +1844,7 @@
           <w:sz w:val="20"/>
           <w:szCs w:val="20"/>
         </w:rPr>
-        <w:t xml:space="preserve">(   )  C)  O solo de uma encosta escorrega</w:t>
+        <w:t xml:space="preserve">(   )  C)  Terra que desce de uma encosta</w:t>
       </w:r>
     </w:p>
     <w:p>
@@ -1873,7 +1873,7 @@
           <w:sz w:val="21"/>
           <w:szCs w:val="21"/>
         </w:rPr>
-        <w:t xml:space="preserve"> Qual destes é um sinal de possível deslizamento?</w:t>
+        <w:t xml:space="preserve"> O que é uma inundação?</w:t>
       </w:r>
     </w:p>
     <w:p>
@@ -1889,7 +1889,7 @@
           <w:sz w:val="20"/>
           <w:szCs w:val="20"/>
         </w:rPr>
-        <w:t xml:space="preserve">(   )  A)  Céu nublado</w:t>
+        <w:t xml:space="preserve">(   )  A)  A mesma coisa que uma enxurrada</w:t>
       </w:r>
     </w:p>
     <w:p>
@@ -1905,7 +1905,7 @@
           <w:sz w:val="20"/>
           <w:szCs w:val="20"/>
         </w:rPr>
-        <w:t xml:space="preserve">(   )  B)  Rachaduras no chão e árvores ou postes inclinados</w:t>
+        <w:t xml:space="preserve">(   )  B)  Quando a água do rio ultrapassa as margens e alcança a planície</w:t>
       </w:r>
     </w:p>
     <w:p>
@@ -1921,7 +1921,7 @@
           <w:sz w:val="20"/>
           <w:szCs w:val="20"/>
         </w:rPr>
-        <w:t xml:space="preserve">(   )  C)  Vento fraco</w:t>
+        <w:t xml:space="preserve">(   )  C)  Água parada em uma poça pequena</w:t>
       </w:r>
     </w:p>
     <w:p>
@@ -1950,7 +1950,7 @@
           <w:sz w:val="21"/>
           <w:szCs w:val="21"/>
         </w:rPr>
-        <w:t xml:space="preserve"> Por que o lixo jogado na rua contribui para alagamentos?</w:t>
+        <w:t xml:space="preserve"> Qual destes é um sinal de possível deslizamento?</w:t>
       </w:r>
     </w:p>
     <w:p>
@@ -1966,7 +1966,7 @@
           <w:sz w:val="20"/>
           <w:szCs w:val="20"/>
         </w:rPr>
-        <w:t xml:space="preserve">(   )  A)  Porque entope as bocas de lobo (bueiros) e a água não escoa</w:t>
+        <w:t xml:space="preserve">(   )  A)  Céu nublado</w:t>
       </w:r>
     </w:p>
     <w:p>
@@ -1982,7 +1982,7 @@
           <w:sz w:val="20"/>
           <w:szCs w:val="20"/>
         </w:rPr>
-        <w:t xml:space="preserve">(   )  B)  Porque o lixo atrai mais chuva</w:t>
+        <w:t xml:space="preserve">(   )  B)  Rachaduras no chão e árvores ou postes inclinados</w:t>
       </w:r>
     </w:p>
     <w:p>
@@ -1998,7 +1998,7 @@
           <w:sz w:val="20"/>
           <w:szCs w:val="20"/>
         </w:rPr>
-        <w:t xml:space="preserve">(   )  C)  Porque o lixo esquenta o asfalto</w:t>
+        <w:t xml:space="preserve">(   )  C)  Vento fraco</w:t>
       </w:r>
     </w:p>
     <w:p>
@@ -2027,7 +2027,7 @@
           <w:sz w:val="21"/>
           <w:szCs w:val="21"/>
         </w:rPr>
-        <w:t xml:space="preserve"> Qual destes perigos costuma ficar escondido em uma rua alagada?</w:t>
+        <w:t xml:space="preserve"> Por que o lixo jogado na rua contribui para alagamentos?</w:t>
       </w:r>
     </w:p>
     <w:p>
@@ -2043,7 +2043,7 @@
           <w:sz w:val="20"/>
           <w:szCs w:val="20"/>
         </w:rPr>
-        <w:t xml:space="preserve">(   )  A)  Poço de visita sem tampão, buracos e fios energizados</w:t>
+        <w:t xml:space="preserve">(   )  A)  Porque entope as bocas de lobo (bueiros) e a água não escoa</w:t>
       </w:r>
     </w:p>
     <w:p>
@@ -2059,7 +2059,7 @@
           <w:sz w:val="20"/>
           <w:szCs w:val="20"/>
         </w:rPr>
-        <w:t xml:space="preserve">(   )  B)  Somente folhas secas</w:t>
+        <w:t xml:space="preserve">(   )  B)  Porque o lixo atrai mais chuva</w:t>
       </w:r>
     </w:p>
     <w:p>
@@ -2075,7 +2075,7 @@
           <w:sz w:val="20"/>
           <w:szCs w:val="20"/>
         </w:rPr>
-        <w:t xml:space="preserve">(   )  C)  Nenhum, a água da chuva é limpa</w:t>
+        <w:t xml:space="preserve">(   )  C)  Porque o lixo esquenta o asfalto</w:t>
       </w:r>
     </w:p>
     <w:p>
@@ -2104,7 +2104,7 @@
           <w:sz w:val="21"/>
           <w:szCs w:val="21"/>
         </w:rPr>
-        <w:t xml:space="preserve"> A água começa a subir dentro de casa. O que fazer com a energia elétrica?</w:t>
+        <w:t xml:space="preserve"> Qual destes perigos costuma ficar escondido em uma rua alagada?</w:t>
       </w:r>
     </w:p>
     <w:p>
@@ -2120,7 +2120,7 @@
           <w:sz w:val="20"/>
           <w:szCs w:val="20"/>
         </w:rPr>
-        <w:t xml:space="preserve">(   )  A)  Deixar ligada para não estragar a comida</w:t>
+        <w:t xml:space="preserve">(   )  A)  Poço de visita sem tampão, buracos e fios energizados</w:t>
       </w:r>
     </w:p>
     <w:p>
@@ -2136,7 +2136,7 @@
           <w:sz w:val="20"/>
           <w:szCs w:val="20"/>
         </w:rPr>
-        <w:t xml:space="preserve">(   )  B)  Desligar o disjuntor geral antes que a água atinja as tomadas</w:t>
+        <w:t xml:space="preserve">(   )  B)  Somente folhas secas</w:t>
       </w:r>
     </w:p>
     <w:p>
@@ -2152,7 +2152,7 @@
           <w:sz w:val="20"/>
           <w:szCs w:val="20"/>
         </w:rPr>
-        <w:t xml:space="preserve">(   )  C)  Só desligar depois que a água baixar</w:t>
+        <w:t xml:space="preserve">(   )  C)  Nenhum, a água da chuva é limpa</w:t>
       </w:r>
     </w:p>
     <w:p>
@@ -2181,7 +2181,7 @@
           <w:sz w:val="21"/>
           <w:szCs w:val="21"/>
         </w:rPr>
-        <w:t xml:space="preserve"> Você vê rachaduras em uma encosta perto da sua casa. O que fazer?</w:t>
+        <w:t xml:space="preserve"> A água começa a subir dentro de casa. O que fazer com a energia elétrica?</w:t>
       </w:r>
     </w:p>
     <w:p>
@@ -2197,7 +2197,7 @@
           <w:sz w:val="20"/>
           <w:szCs w:val="20"/>
         </w:rPr>
-        <w:t xml:space="preserve">(   )  A)  Tapar com cimento e ficar tranquilo</w:t>
+        <w:t xml:space="preserve">(   )  A)  Deixar ligada para não estragar a comida</w:t>
       </w:r>
     </w:p>
     <w:p>
@@ -2213,7 +2213,7 @@
           <w:sz w:val="20"/>
           <w:szCs w:val="20"/>
         </w:rPr>
-        <w:t xml:space="preserve">(   )  B)  Afastar-se e avisar a Defesa Civil (199)</w:t>
+        <w:t xml:space="preserve">(   )  B)  Desligar o disjuntor geral antes que a água atinja as tomadas</w:t>
       </w:r>
     </w:p>
     <w:p>
@@ -2229,7 +2229,7 @@
           <w:sz w:val="20"/>
           <w:szCs w:val="20"/>
         </w:rPr>
-        <w:t xml:space="preserve">(   )  C)  Subir na encosta para olhar de perto</w:t>
+        <w:t xml:space="preserve">(   )  C)  Só desligar depois que a água baixar</w:t>
       </w:r>
     </w:p>
     <w:p>
@@ -2258,7 +2258,7 @@
           <w:sz w:val="21"/>
           <w:szCs w:val="21"/>
         </w:rPr>
-        <w:t xml:space="preserve"> Você já saiu de casa e lembra que esqueceu um brinquedo lá dentro. O que fazer?</w:t>
+        <w:t xml:space="preserve"> Você vê rachaduras em uma encosta perto da sua casa. O que fazer?</w:t>
       </w:r>
     </w:p>
     <w:p>
@@ -2274,7 +2274,7 @@
           <w:sz w:val="20"/>
           <w:szCs w:val="20"/>
         </w:rPr>
-        <w:t xml:space="preserve">(   )  A)  Voltar rapidamente para pegar</w:t>
+        <w:t xml:space="preserve">(   )  A)  Tapar com cimento e ficar tranquilo</w:t>
       </w:r>
     </w:p>
     <w:p>
@@ -2290,7 +2290,7 @@
           <w:sz w:val="20"/>
           <w:szCs w:val="20"/>
         </w:rPr>
-        <w:t xml:space="preserve">(   )  B)  Não voltar: objetos podem ser repostos, vidas não</w:t>
+        <w:t xml:space="preserve">(   )  B)  Afastar-se e avisar a Defesa Civil (199)</w:t>
       </w:r>
     </w:p>
     <w:p>
@@ -2306,7 +2306,7 @@
           <w:sz w:val="20"/>
           <w:szCs w:val="20"/>
         </w:rPr>
-        <w:t xml:space="preserve">(   )  C)  Pedir para uma criança buscar</w:t>
+        <w:t xml:space="preserve">(   )  C)  Subir na encosta para olhar de perto</w:t>
       </w:r>
     </w:p>
     <w:p>
@@ -2327,6 +2327,83 @@
           <w:szCs w:val="21"/>
         </w:rPr>
         <w:t xml:space="preserve">12.</w:t>
+      </w:r>
+      <w:r>
+        <w:rPr>
+          <w:rFonts w:ascii="Calibri" w:cs="Calibri" w:eastAsia="Calibri" w:hAnsi="Calibri"/>
+          <w:color w:val="14213D"/>
+          <w:sz w:val="21"/>
+          <w:szCs w:val="21"/>
+        </w:rPr>
+        <w:t xml:space="preserve"> Você já saiu de casa e lembra que esqueceu um brinquedo lá dentro. O que fazer?</w:t>
+      </w:r>
+    </w:p>
+    <w:p>
+      <w:pPr>
+        <w:keepNext/>
+        <w:spacing w:after="30" w:before="0" w:line="276"/>
+        <w:ind w:left="400"/>
+      </w:pPr>
+      <w:r>
+        <w:rPr>
+          <w:rFonts w:ascii="Calibri" w:cs="Calibri" w:eastAsia="Calibri" w:hAnsi="Calibri"/>
+          <w:color w:val="14213D"/>
+          <w:sz w:val="20"/>
+          <w:szCs w:val="20"/>
+        </w:rPr>
+        <w:t xml:space="preserve">(   )  A)  Voltar rapidamente para pegar</w:t>
+      </w:r>
+    </w:p>
+    <w:p>
+      <w:pPr>
+        <w:keepNext/>
+        <w:spacing w:after="30" w:before="0" w:line="276"/>
+        <w:ind w:left="400"/>
+      </w:pPr>
+      <w:r>
+        <w:rPr>
+          <w:rFonts w:ascii="Calibri" w:cs="Calibri" w:eastAsia="Calibri" w:hAnsi="Calibri"/>
+          <w:color w:val="14213D"/>
+          <w:sz w:val="20"/>
+          <w:szCs w:val="20"/>
+        </w:rPr>
+        <w:t xml:space="preserve">(   )  B)  Não voltar: objetos podem ser repostos, vidas não</w:t>
+      </w:r>
+    </w:p>
+    <w:p>
+      <w:pPr>
+        <w:keepNext w:val="false"/>
+        <w:spacing w:after="30" w:before="0" w:line="276"/>
+        <w:ind w:left="400"/>
+      </w:pPr>
+      <w:r>
+        <w:rPr>
+          <w:rFonts w:ascii="Calibri" w:cs="Calibri" w:eastAsia="Calibri" w:hAnsi="Calibri"/>
+          <w:color w:val="14213D"/>
+          <w:sz w:val="20"/>
+          <w:szCs w:val="20"/>
+        </w:rPr>
+        <w:t xml:space="preserve">(   )  C)  Pedir para uma criança buscar</w:t>
+      </w:r>
+    </w:p>
+    <w:p>
+      <w:pPr>
+        <w:spacing w:after="50"/>
+      </w:pPr>
+    </w:p>
+    <w:p>
+      <w:pPr>
+        <w:keepNext/>
+        <w:spacing w:after="50" w:before="0" w:line="276"/>
+      </w:pPr>
+      <w:r>
+        <w:rPr>
+          <w:rFonts w:ascii="Calibri" w:cs="Calibri" w:eastAsia="Calibri" w:hAnsi="Calibri"/>
+          <w:color w:val="14213D"/>
+          <w:sz w:val="21"/>
+          <w:szCs w:val="21"/>
+        </w:rPr>
+        <w:t xml:space="preserve">13.</w:t>
       </w:r>
       <w:r>
         <w:rPr>
@@ -3227,7 +3304,7 @@
                 <w:sz w:val="19"/>
                 <w:szCs w:val="19"/>
               </w:rPr>
-              <w:t xml:space="preserve">O rio sobe e transborda para as áreas próximas</w:t>
+              <w:t xml:space="preserve">Aumento do nível da água dentro do rio, sem transbordar</w:t>
             </w:r>
           </w:p>
         </w:tc>
@@ -3337,7 +3414,7 @@
                 <w:sz w:val="19"/>
                 <w:szCs w:val="19"/>
               </w:rPr>
-              <w:t xml:space="preserve">Rachaduras no chão e árvores ou postes inclinados</w:t>
+              <w:t xml:space="preserve">Quando a água do rio ultrapassa as margens e alcança a planície</w:t>
             </w:r>
           </w:p>
         </w:tc>
@@ -3410,7 +3487,7 @@
                 <w:sz w:val="19"/>
                 <w:szCs w:val="19"/>
               </w:rPr>
-              <w:t xml:space="preserve">A</w:t>
+              <w:t xml:space="preserve">B</w:t>
             </w:r>
           </w:p>
         </w:tc>
@@ -3444,7 +3521,7 @@
                 <w:sz w:val="19"/>
                 <w:szCs w:val="19"/>
               </w:rPr>
-              <w:t xml:space="preserve">Porque entope as bocas de lobo (bueiros) e a água não escoa</w:t>
+              <w:t xml:space="preserve">Rachaduras no chão e árvores ou postes inclinados</w:t>
             </w:r>
           </w:p>
         </w:tc>
@@ -3554,7 +3631,7 @@
                 <w:sz w:val="19"/>
                 <w:szCs w:val="19"/>
               </w:rPr>
-              <w:t xml:space="preserve">Poço de visita sem tampão, buracos e fios energizados</w:t>
+              <w:t xml:space="preserve">Porque entope as bocas de lobo (bueiros) e a água não escoa</w:t>
             </w:r>
           </w:p>
         </w:tc>
@@ -3627,7 +3704,7 @@
                 <w:sz w:val="19"/>
                 <w:szCs w:val="19"/>
               </w:rPr>
-              <w:t xml:space="preserve">B</w:t>
+              <w:t xml:space="preserve">A</w:t>
             </w:r>
           </w:p>
         </w:tc>
@@ -3661,7 +3738,7 @@
                 <w:sz w:val="19"/>
                 <w:szCs w:val="19"/>
               </w:rPr>
-              <w:t xml:space="preserve">Desligar o disjuntor geral antes que a água atinja as tomadas</w:t>
+              <w:t xml:space="preserve">Poço de visita sem tampão, buracos e fios energizados</w:t>
             </w:r>
           </w:p>
         </w:tc>
@@ -3771,7 +3848,7 @@
                 <w:sz w:val="19"/>
                 <w:szCs w:val="19"/>
               </w:rPr>
-              <w:t xml:space="preserve">Afastar-se e avisar a Defesa Civil (199)</w:t>
+              <w:t xml:space="preserve">Desligar o disjuntor geral antes que a água atinja as tomadas</w:t>
             </w:r>
           </w:p>
         </w:tc>
@@ -3878,7 +3955,7 @@
                 <w:sz w:val="19"/>
                 <w:szCs w:val="19"/>
               </w:rPr>
-              <w:t xml:space="preserve">Não voltar: objetos podem ser repostos, vidas não</w:t>
+              <w:t xml:space="preserve">Afastar-se e avisar a Defesa Civil (199)</w:t>
             </w:r>
           </w:p>
         </w:tc>
@@ -3967,6 +4044,113 @@
               <w:right w:val="single" w:color="C9D6E4" w:sz="4"/>
             </w:tcBorders>
             <w:shd w:fill="F6F9FC" w:color="auto" w:val="clear"/>
+            <w:tcMar>
+              <w:top w:type="dxa" w:w="70"/>
+              <w:left w:type="dxa" w:w="110"/>
+              <w:bottom w:type="dxa" w:w="70"/>
+              <w:right w:type="dxa" w:w="110"/>
+            </w:tcMar>
+            <w:vAlign w:val="top"/>
+          </w:tcPr>
+          <w:p>
+            <w:pPr>
+              <w:spacing w:after="40" w:before="0" w:line="276"/>
+            </w:pPr>
+            <w:r>
+              <w:rPr>
+                <w:rFonts w:ascii="Calibri" w:cs="Calibri" w:eastAsia="Calibri" w:hAnsi="Calibri"/>
+                <w:b w:val="false"/>
+                <w:bCs w:val="false"/>
+                <w:color w:val="14213D"/>
+                <w:sz w:val="19"/>
+                <w:szCs w:val="19"/>
+              </w:rPr>
+              <w:t xml:space="preserve">Não voltar: objetos podem ser repostos, vidas não</w:t>
+            </w:r>
+          </w:p>
+        </w:tc>
+      </w:tr>
+      <w:tr>
+        <w:trPr>
+          <w:cantSplit/>
+        </w:trPr>
+        <w:tc>
+          <w:tcPr>
+            <w:tcW w:type="dxa" w:w="1000"/>
+            <w:tcBorders>
+              <w:top w:val="single" w:color="C9D6E4" w:sz="4"/>
+              <w:left w:val="single" w:color="C9D6E4" w:sz="4"/>
+              <w:bottom w:val="single" w:color="C9D6E4" w:sz="4"/>
+              <w:right w:val="single" w:color="C9D6E4" w:sz="4"/>
+            </w:tcBorders>
+            <w:tcMar>
+              <w:top w:type="dxa" w:w="70"/>
+              <w:left w:type="dxa" w:w="110"/>
+              <w:bottom w:type="dxa" w:w="70"/>
+              <w:right w:type="dxa" w:w="110"/>
+            </w:tcMar>
+            <w:vAlign w:val="top"/>
+          </w:tcPr>
+          <w:p>
+            <w:pPr>
+              <w:spacing w:after="40" w:before="0" w:line="276"/>
+            </w:pPr>
+            <w:r>
+              <w:rPr>
+                <w:rFonts w:ascii="Calibri" w:cs="Calibri" w:eastAsia="Calibri" w:hAnsi="Calibri"/>
+                <w:b/>
+                <w:bCs/>
+                <w:color w:val="14213D"/>
+                <w:sz w:val="19"/>
+                <w:szCs w:val="19"/>
+              </w:rPr>
+              <w:t xml:space="preserve">13</w:t>
+            </w:r>
+          </w:p>
+        </w:tc>
+        <w:tc>
+          <w:tcPr>
+            <w:tcW w:type="dxa" w:w="1600"/>
+            <w:tcBorders>
+              <w:top w:val="single" w:color="C9D6E4" w:sz="4"/>
+              <w:left w:val="single" w:color="C9D6E4" w:sz="4"/>
+              <w:bottom w:val="single" w:color="C9D6E4" w:sz="4"/>
+              <w:right w:val="single" w:color="C9D6E4" w:sz="4"/>
+            </w:tcBorders>
+            <w:tcMar>
+              <w:top w:type="dxa" w:w="70"/>
+              <w:left w:type="dxa" w:w="110"/>
+              <w:bottom w:type="dxa" w:w="70"/>
+              <w:right w:type="dxa" w:w="110"/>
+            </w:tcMar>
+            <w:vAlign w:val="top"/>
+          </w:tcPr>
+          <w:p>
+            <w:pPr>
+              <w:spacing w:after="40" w:before="0" w:line="276"/>
+            </w:pPr>
+            <w:r>
+              <w:rPr>
+                <w:rFonts w:ascii="Calibri" w:cs="Calibri" w:eastAsia="Calibri" w:hAnsi="Calibri"/>
+                <w:b/>
+                <w:bCs/>
+                <w:color w:val="14213D"/>
+                <w:sz w:val="19"/>
+                <w:szCs w:val="19"/>
+              </w:rPr>
+              <w:t xml:space="preserve">B</w:t>
+            </w:r>
+          </w:p>
+        </w:tc>
+        <w:tc>
+          <w:tcPr>
+            <w:tcW w:type="dxa" w:w="7038"/>
+            <w:tcBorders>
+              <w:top w:val="single" w:color="C9D6E4" w:sz="4"/>
+              <w:left w:val="single" w:color="C9D6E4" w:sz="4"/>
+              <w:bottom w:val="single" w:color="C9D6E4" w:sz="4"/>
+              <w:right w:val="single" w:color="C9D6E4" w:sz="4"/>
+            </w:tcBorders>
             <w:tcMar>
               <w:top w:type="dxa" w:w="70"/>
               <w:left w:type="dxa" w:w="110"/>

</xml_diff>